<commit_message>
added  Visual Security & Automation test scenario
</commit_message>
<xml_diff>
--- a/Keeper_Test_Scenario.docx
+++ b/Keeper_Test_Scenario.docx
@@ -2153,384 +2153,384 @@
           <w:sz w:val="32"/>
           <w:szCs w:val="32"/>
         </w:rPr>
-        <w:t xml:space="preserve">18. </w:t>
+        <w:t>18. Keeper Secrets Manager (KSM)</w:t>
+      </w:r>
+    </w:p>
+    <w:p>
+      <w:pPr>
+        <w:pStyle w:val="23"/>
+        <w:rPr>
+          <w:sz w:val="32"/>
+          <w:szCs w:val="32"/>
+        </w:rPr>
+      </w:pPr>
+      <w:r>
+        <w:rPr>
+          <w:sz w:val="32"/>
+          <w:szCs w:val="32"/>
+        </w:rPr>
+        <w:t>TS_103: API key rotation.</w:t>
+      </w:r>
+    </w:p>
+    <w:p>
+      <w:pPr>
+        <w:pStyle w:val="23"/>
+        <w:rPr>
+          <w:sz w:val="32"/>
+          <w:szCs w:val="32"/>
+        </w:rPr>
+      </w:pPr>
+      <w:r>
+        <w:rPr>
+          <w:sz w:val="32"/>
+          <w:szCs w:val="32"/>
+        </w:rPr>
+        <w:t>TS_104: CLI integration.</w:t>
+      </w:r>
+    </w:p>
+    <w:p>
+      <w:pPr>
+        <w:pStyle w:val="23"/>
+        <w:rPr>
+          <w:sz w:val="32"/>
+          <w:szCs w:val="32"/>
+        </w:rPr>
+      </w:pPr>
+      <w:r>
+        <w:rPr>
+          <w:sz w:val="32"/>
+          <w:szCs w:val="32"/>
+        </w:rPr>
+        <w:t>TS_105: SDK integration.</w:t>
+      </w:r>
+    </w:p>
+    <w:p>
+      <w:pPr>
+        <w:pStyle w:val="3"/>
+        <w:rPr>
+          <w:sz w:val="32"/>
+          <w:szCs w:val="32"/>
+        </w:rPr>
+      </w:pPr>
+      <w:r>
+        <w:rPr>
+          <w:sz w:val="32"/>
+          <w:szCs w:val="32"/>
+        </w:rPr>
+        <w:t>19. Compliance &amp; Website Integrity</w:t>
+      </w:r>
+    </w:p>
+    <w:p>
+      <w:pPr>
+        <w:pStyle w:val="23"/>
+        <w:rPr>
+          <w:sz w:val="32"/>
+          <w:szCs w:val="32"/>
+        </w:rPr>
+      </w:pPr>
+      <w:r>
+        <w:rPr>
+          <w:sz w:val="32"/>
+          <w:szCs w:val="32"/>
+        </w:rPr>
+        <w:t>TS_106: GDPR data residency.</w:t>
+      </w:r>
+    </w:p>
+    <w:p>
+      <w:pPr>
+        <w:pStyle w:val="23"/>
+        <w:rPr>
+          <w:sz w:val="32"/>
+          <w:szCs w:val="32"/>
+        </w:rPr>
+      </w:pPr>
+      <w:r>
+        <w:rPr>
+          <w:sz w:val="32"/>
+          <w:szCs w:val="32"/>
+        </w:rPr>
+        <w:t>TS_107: Cookie consent.</w:t>
+      </w:r>
+    </w:p>
+    <w:p>
+      <w:pPr>
+        <w:pStyle w:val="23"/>
+        <w:rPr>
+          <w:sz w:val="32"/>
+          <w:szCs w:val="32"/>
+        </w:rPr>
+      </w:pPr>
+      <w:r>
+        <w:rPr>
+          <w:sz w:val="32"/>
+          <w:szCs w:val="32"/>
+        </w:rPr>
+        <w:t>TS_108: Support ticket form.</w:t>
+      </w:r>
+    </w:p>
+    <w:p>
+      <w:pPr>
+        <w:pStyle w:val="23"/>
+        <w:rPr>
+          <w:sz w:val="32"/>
+          <w:szCs w:val="32"/>
+        </w:rPr>
+      </w:pPr>
+      <w:r>
+        <w:rPr>
+          <w:sz w:val="32"/>
+          <w:szCs w:val="32"/>
+        </w:rPr>
+        <w:t>TS_109: Error handling pages.</w:t>
+      </w:r>
+    </w:p>
+    <w:p>
+      <w:pPr>
+        <w:pStyle w:val="3"/>
+        <w:rPr>
+          <w:sz w:val="32"/>
+          <w:szCs w:val="32"/>
+        </w:rPr>
+      </w:pPr>
+      <w:r>
+        <w:rPr>
+          <w:sz w:val="32"/>
+          <w:szCs w:val="32"/>
+        </w:rPr>
+        <w:t>20. Final Regression &amp; Marketing</w:t>
+      </w:r>
+    </w:p>
+    <w:p>
+      <w:pPr>
+        <w:pStyle w:val="23"/>
+        <w:rPr>
+          <w:sz w:val="32"/>
+          <w:szCs w:val="32"/>
+        </w:rPr>
+      </w:pPr>
+      <w:r>
+        <w:rPr>
+          <w:sz w:val="32"/>
+          <w:szCs w:val="32"/>
+        </w:rPr>
+        <w:t>TS_110: SEO meta tags.</w:t>
+      </w:r>
+    </w:p>
+    <w:p>
+      <w:pPr>
+        <w:pStyle w:val="23"/>
+        <w:rPr>
+          <w:sz w:val="32"/>
+          <w:szCs w:val="32"/>
+        </w:rPr>
+      </w:pPr>
+      <w:r>
+        <w:rPr>
+          <w:sz w:val="32"/>
+          <w:szCs w:val="32"/>
+        </w:rPr>
+        <w:t>TS_111: Social sharing OG tags.</w:t>
+      </w:r>
+    </w:p>
+    <w:p>
+      <w:pPr>
+        <w:pStyle w:val="23"/>
+        <w:rPr>
+          <w:sz w:val="32"/>
+          <w:szCs w:val="32"/>
+        </w:rPr>
+      </w:pPr>
+      <w:r>
+        <w:rPr>
+          <w:sz w:val="32"/>
+          <w:szCs w:val="32"/>
+        </w:rPr>
+        <w:t>TS_112: Broken link checks.</w:t>
+      </w:r>
+    </w:p>
+    <w:p>
+      <w:pPr>
+        <w:pStyle w:val="23"/>
+        <w:rPr>
+          <w:sz w:val="32"/>
+          <w:szCs w:val="32"/>
+        </w:rPr>
+      </w:pPr>
+      <w:r>
+        <w:rPr>
+          <w:sz w:val="32"/>
+          <w:szCs w:val="32"/>
+        </w:rPr>
+        <w:t>TS_113: Browser back behavior.</w:t>
+      </w:r>
+    </w:p>
+    <w:p>
+      <w:pPr>
+        <w:pStyle w:val="23"/>
+        <w:rPr>
+          <w:sz w:val="32"/>
+          <w:szCs w:val="32"/>
+        </w:rPr>
+      </w:pPr>
+      <w:r>
+        <w:rPr>
+          <w:sz w:val="32"/>
+          <w:szCs w:val="32"/>
+        </w:rPr>
+        <w:t>TS_114: Lighthouse performance.</w:t>
+      </w:r>
+    </w:p>
+    <w:p>
+      <w:pPr>
+        <w:pStyle w:val="23"/>
+        <w:rPr>
+          <w:sz w:val="32"/>
+          <w:szCs w:val="32"/>
+        </w:rPr>
+      </w:pPr>
+      <w:r>
+        <w:rPr>
+          <w:sz w:val="32"/>
+          <w:szCs w:val="32"/>
+        </w:rPr>
+        <w:t>TS_115: Branding consistency.</w:t>
+      </w:r>
+    </w:p>
+    <w:p>
+      <w:pPr>
+        <w:pStyle w:val="3"/>
+        <w:rPr>
+          <w:sz w:val="32"/>
+          <w:szCs w:val="32"/>
+        </w:rPr>
+      </w:pPr>
+      <w:r>
+        <w:rPr>
+          <w:sz w:val="32"/>
+          <w:szCs w:val="32"/>
+        </w:rPr>
+        <w:t>21. Advanced Lifecycle &amp; Network Resiliency</w:t>
+      </w:r>
+    </w:p>
+    <w:p>
+      <w:pPr>
+        <w:pStyle w:val="23"/>
+        <w:rPr>
+          <w:sz w:val="32"/>
+          <w:szCs w:val="32"/>
+        </w:rPr>
+      </w:pPr>
+      <w:r>
+        <w:rPr>
+          <w:sz w:val="32"/>
+          <w:szCs w:val="32"/>
+        </w:rPr>
+        <w:t>TS_116: Auto-update locking.</w:t>
+      </w:r>
+    </w:p>
+    <w:p>
+      <w:pPr>
+        <w:pStyle w:val="23"/>
+        <w:rPr>
+          <w:sz w:val="32"/>
+          <w:szCs w:val="32"/>
+        </w:rPr>
+      </w:pPr>
+      <w:r>
+        <w:rPr>
+          <w:sz w:val="32"/>
+          <w:szCs w:val="32"/>
+        </w:rPr>
+        <w:t>TS_117: Crash recovery.</w:t>
+      </w:r>
+    </w:p>
+    <w:p>
+      <w:pPr>
+        <w:pStyle w:val="23"/>
+        <w:rPr>
+          <w:sz w:val="32"/>
+          <w:szCs w:val="32"/>
+        </w:rPr>
+      </w:pPr>
+      <w:r>
+        <w:rPr>
+          <w:sz w:val="32"/>
+          <w:szCs w:val="32"/>
+        </w:rPr>
+        <w:t>TS_118: Flaky network sync.</w:t>
+      </w:r>
+    </w:p>
+    <w:p>
+      <w:pPr>
+        <w:pStyle w:val="23"/>
+        <w:rPr>
+          <w:sz w:val="32"/>
+          <w:szCs w:val="32"/>
+        </w:rPr>
+      </w:pPr>
+      <w:r>
+        <w:rPr>
+          <w:sz w:val="32"/>
+          <w:szCs w:val="32"/>
+        </w:rPr>
+        <w:t>TS_119: Captive portal handling.</w:t>
+      </w:r>
+    </w:p>
+    <w:p>
+      <w:pPr>
+        <w:pStyle w:val="23"/>
+        <w:rPr>
+          <w:sz w:val="32"/>
+          <w:szCs w:val="32"/>
+        </w:rPr>
+      </w:pPr>
+      <w:r>
+        <w:rPr>
+          <w:sz w:val="32"/>
+          <w:szCs w:val="32"/>
+        </w:rPr>
+        <w:t>TS_120: UI redressing prevention.</w:t>
+      </w:r>
+    </w:p>
+    <w:p>
+      <w:pPr>
+        <w:pStyle w:val="3"/>
+        <w:rPr>
+          <w:sz w:val="32"/>
+          <w:szCs w:val="32"/>
+        </w:rPr>
+      </w:pPr>
+      <w:r>
+        <w:rPr>
+          <w:sz w:val="32"/>
+          <w:szCs w:val="32"/>
+        </w:rPr>
+        <w:t>22. Visual Security &amp; Automation</w:t>
+      </w:r>
+    </w:p>
+    <w:p>
+      <w:pPr>
+        <w:pStyle w:val="23"/>
+        <w:rPr>
+          <w:sz w:val="32"/>
+          <w:szCs w:val="32"/>
+        </w:rPr>
+      </w:pPr>
+      <w:r>
+        <w:rPr>
+          <w:sz w:val="32"/>
+          <w:szCs w:val="32"/>
+        </w:rPr>
+        <w:t>TS_121: Clipbo</w:t>
       </w:r>
       <w:bookmarkStart w:id="0" w:name="_GoBack"/>
-      <w:r>
-        <w:rPr>
-          <w:sz w:val="32"/>
-          <w:szCs w:val="32"/>
-        </w:rPr>
-        <w:t>Keeper Secrets Manager (KSM)</w:t>
-      </w:r>
       <w:bookmarkEnd w:id="0"/>
-    </w:p>
-    <w:p>
-      <w:pPr>
-        <w:pStyle w:val="23"/>
-        <w:rPr>
-          <w:sz w:val="32"/>
-          <w:szCs w:val="32"/>
-        </w:rPr>
-      </w:pPr>
-      <w:r>
-        <w:rPr>
-          <w:sz w:val="32"/>
-          <w:szCs w:val="32"/>
-        </w:rPr>
-        <w:t>TS_103: API key rotation.</w:t>
-      </w:r>
-    </w:p>
-    <w:p>
-      <w:pPr>
-        <w:pStyle w:val="23"/>
-        <w:rPr>
-          <w:sz w:val="32"/>
-          <w:szCs w:val="32"/>
-        </w:rPr>
-      </w:pPr>
-      <w:r>
-        <w:rPr>
-          <w:sz w:val="32"/>
-          <w:szCs w:val="32"/>
-        </w:rPr>
-        <w:t>TS_104: CLI integration.</w:t>
-      </w:r>
-    </w:p>
-    <w:p>
-      <w:pPr>
-        <w:pStyle w:val="23"/>
-        <w:rPr>
-          <w:sz w:val="32"/>
-          <w:szCs w:val="32"/>
-        </w:rPr>
-      </w:pPr>
-      <w:r>
-        <w:rPr>
-          <w:sz w:val="32"/>
-          <w:szCs w:val="32"/>
-        </w:rPr>
-        <w:t>TS_105: SDK integration.</w:t>
-      </w:r>
-    </w:p>
-    <w:p>
-      <w:pPr>
-        <w:pStyle w:val="3"/>
-        <w:rPr>
-          <w:sz w:val="32"/>
-          <w:szCs w:val="32"/>
-        </w:rPr>
-      </w:pPr>
-      <w:r>
-        <w:rPr>
-          <w:sz w:val="32"/>
-          <w:szCs w:val="32"/>
-        </w:rPr>
-        <w:t>19. Compliance &amp; Website Integrity</w:t>
-      </w:r>
-    </w:p>
-    <w:p>
-      <w:pPr>
-        <w:pStyle w:val="23"/>
-        <w:rPr>
-          <w:sz w:val="32"/>
-          <w:szCs w:val="32"/>
-        </w:rPr>
-      </w:pPr>
-      <w:r>
-        <w:rPr>
-          <w:sz w:val="32"/>
-          <w:szCs w:val="32"/>
-        </w:rPr>
-        <w:t>TS_106: GDPR data residency.</w:t>
-      </w:r>
-    </w:p>
-    <w:p>
-      <w:pPr>
-        <w:pStyle w:val="23"/>
-        <w:rPr>
-          <w:sz w:val="32"/>
-          <w:szCs w:val="32"/>
-        </w:rPr>
-      </w:pPr>
-      <w:r>
-        <w:rPr>
-          <w:sz w:val="32"/>
-          <w:szCs w:val="32"/>
-        </w:rPr>
-        <w:t>TS_107: Cookie consent.</w:t>
-      </w:r>
-    </w:p>
-    <w:p>
-      <w:pPr>
-        <w:pStyle w:val="23"/>
-        <w:rPr>
-          <w:sz w:val="32"/>
-          <w:szCs w:val="32"/>
-        </w:rPr>
-      </w:pPr>
-      <w:r>
-        <w:rPr>
-          <w:sz w:val="32"/>
-          <w:szCs w:val="32"/>
-        </w:rPr>
-        <w:t>TS_108: Support ticket form.</w:t>
-      </w:r>
-    </w:p>
-    <w:p>
-      <w:pPr>
-        <w:pStyle w:val="23"/>
-        <w:rPr>
-          <w:sz w:val="32"/>
-          <w:szCs w:val="32"/>
-        </w:rPr>
-      </w:pPr>
-      <w:r>
-        <w:rPr>
-          <w:sz w:val="32"/>
-          <w:szCs w:val="32"/>
-        </w:rPr>
-        <w:t>TS_109: Error handling pages.</w:t>
-      </w:r>
-    </w:p>
-    <w:p>
-      <w:pPr>
-        <w:pStyle w:val="3"/>
-        <w:rPr>
-          <w:sz w:val="32"/>
-          <w:szCs w:val="32"/>
-        </w:rPr>
-      </w:pPr>
-      <w:r>
-        <w:rPr>
-          <w:sz w:val="32"/>
-          <w:szCs w:val="32"/>
-        </w:rPr>
-        <w:t>20. Final Regression &amp; Marketing</w:t>
-      </w:r>
-    </w:p>
-    <w:p>
-      <w:pPr>
-        <w:pStyle w:val="23"/>
-        <w:rPr>
-          <w:sz w:val="32"/>
-          <w:szCs w:val="32"/>
-        </w:rPr>
-      </w:pPr>
-      <w:r>
-        <w:rPr>
-          <w:sz w:val="32"/>
-          <w:szCs w:val="32"/>
-        </w:rPr>
-        <w:t>TS_110: SEO meta tags.</w:t>
-      </w:r>
-    </w:p>
-    <w:p>
-      <w:pPr>
-        <w:pStyle w:val="23"/>
-        <w:rPr>
-          <w:sz w:val="32"/>
-          <w:szCs w:val="32"/>
-        </w:rPr>
-      </w:pPr>
-      <w:r>
-        <w:rPr>
-          <w:sz w:val="32"/>
-          <w:szCs w:val="32"/>
-        </w:rPr>
-        <w:t>TS_111: Social sharing OG tags.</w:t>
-      </w:r>
-    </w:p>
-    <w:p>
-      <w:pPr>
-        <w:pStyle w:val="23"/>
-        <w:rPr>
-          <w:sz w:val="32"/>
-          <w:szCs w:val="32"/>
-        </w:rPr>
-      </w:pPr>
-      <w:r>
-        <w:rPr>
-          <w:sz w:val="32"/>
-          <w:szCs w:val="32"/>
-        </w:rPr>
-        <w:t>TS_112: Broken link checks.</w:t>
-      </w:r>
-    </w:p>
-    <w:p>
-      <w:pPr>
-        <w:pStyle w:val="23"/>
-        <w:rPr>
-          <w:sz w:val="32"/>
-          <w:szCs w:val="32"/>
-        </w:rPr>
-      </w:pPr>
-      <w:r>
-        <w:rPr>
-          <w:sz w:val="32"/>
-          <w:szCs w:val="32"/>
-        </w:rPr>
-        <w:t>TS_113: Browser back behavior.</w:t>
-      </w:r>
-    </w:p>
-    <w:p>
-      <w:pPr>
-        <w:pStyle w:val="23"/>
-        <w:rPr>
-          <w:sz w:val="32"/>
-          <w:szCs w:val="32"/>
-        </w:rPr>
-      </w:pPr>
-      <w:r>
-        <w:rPr>
-          <w:sz w:val="32"/>
-          <w:szCs w:val="32"/>
-        </w:rPr>
-        <w:t>TS_114: Lighthouse performance.</w:t>
-      </w:r>
-    </w:p>
-    <w:p>
-      <w:pPr>
-        <w:pStyle w:val="23"/>
-        <w:rPr>
-          <w:sz w:val="32"/>
-          <w:szCs w:val="32"/>
-        </w:rPr>
-      </w:pPr>
-      <w:r>
-        <w:rPr>
-          <w:sz w:val="32"/>
-          <w:szCs w:val="32"/>
-        </w:rPr>
-        <w:t>TS_115: Branding consistency.</w:t>
-      </w:r>
-    </w:p>
-    <w:p>
-      <w:pPr>
-        <w:pStyle w:val="3"/>
-        <w:rPr>
-          <w:sz w:val="32"/>
-          <w:szCs w:val="32"/>
-        </w:rPr>
-      </w:pPr>
-      <w:r>
-        <w:rPr>
-          <w:sz w:val="32"/>
-          <w:szCs w:val="32"/>
-        </w:rPr>
-        <w:t>21. Advanced Lifecycle &amp; Network Resiliency</w:t>
-      </w:r>
-    </w:p>
-    <w:p>
-      <w:pPr>
-        <w:pStyle w:val="23"/>
-        <w:rPr>
-          <w:sz w:val="32"/>
-          <w:szCs w:val="32"/>
-        </w:rPr>
-      </w:pPr>
-      <w:r>
-        <w:rPr>
-          <w:sz w:val="32"/>
-          <w:szCs w:val="32"/>
-        </w:rPr>
-        <w:t>TS_116: Auto-update locking.</w:t>
-      </w:r>
-    </w:p>
-    <w:p>
-      <w:pPr>
-        <w:pStyle w:val="23"/>
-        <w:rPr>
-          <w:sz w:val="32"/>
-          <w:szCs w:val="32"/>
-        </w:rPr>
-      </w:pPr>
-      <w:r>
-        <w:rPr>
-          <w:sz w:val="32"/>
-          <w:szCs w:val="32"/>
-        </w:rPr>
-        <w:t>TS_117: Crash recovery.</w:t>
-      </w:r>
-    </w:p>
-    <w:p>
-      <w:pPr>
-        <w:pStyle w:val="23"/>
-        <w:rPr>
-          <w:sz w:val="32"/>
-          <w:szCs w:val="32"/>
-        </w:rPr>
-      </w:pPr>
-      <w:r>
-        <w:rPr>
-          <w:sz w:val="32"/>
-          <w:szCs w:val="32"/>
-        </w:rPr>
-        <w:t>TS_118: Flaky network sync.</w:t>
-      </w:r>
-    </w:p>
-    <w:p>
-      <w:pPr>
-        <w:pStyle w:val="23"/>
-        <w:rPr>
-          <w:sz w:val="32"/>
-          <w:szCs w:val="32"/>
-        </w:rPr>
-      </w:pPr>
-      <w:r>
-        <w:rPr>
-          <w:sz w:val="32"/>
-          <w:szCs w:val="32"/>
-        </w:rPr>
-        <w:t>TS_119: Captive portal handling.</w:t>
-      </w:r>
-    </w:p>
-    <w:p>
-      <w:pPr>
-        <w:pStyle w:val="23"/>
-        <w:rPr>
-          <w:sz w:val="32"/>
-          <w:szCs w:val="32"/>
-        </w:rPr>
-      </w:pPr>
-      <w:r>
-        <w:rPr>
-          <w:sz w:val="32"/>
-          <w:szCs w:val="32"/>
-        </w:rPr>
-        <w:t>TS_120: UI redressing prevention.</w:t>
-      </w:r>
-    </w:p>
-    <w:p>
-      <w:pPr>
-        <w:pStyle w:val="3"/>
-        <w:rPr>
-          <w:sz w:val="32"/>
-          <w:szCs w:val="32"/>
-        </w:rPr>
-      </w:pPr>
-      <w:r>
-        <w:rPr>
-          <w:sz w:val="32"/>
-          <w:szCs w:val="32"/>
-        </w:rPr>
-        <w:t>22. Visual Security &amp; Automation</w:t>
-      </w:r>
-    </w:p>
-    <w:p>
-      <w:pPr>
-        <w:pStyle w:val="23"/>
-        <w:rPr>
-          <w:sz w:val="32"/>
-          <w:szCs w:val="32"/>
-        </w:rPr>
-      </w:pPr>
-      <w:r>
-        <w:rPr>
-          <w:sz w:val="32"/>
-          <w:szCs w:val="32"/>
-        </w:rPr>
-        <w:t>TS_121: Clipboard clear on exit.</w:t>
+      <w:r>
+        <w:rPr>
+          <w:sz w:val="32"/>
+          <w:szCs w:val="32"/>
+        </w:rPr>
+        <w:t>ard clear on exit.</w:t>
       </w:r>
     </w:p>
     <w:p>

</xml_diff>